<commit_message>
IQOS bullet: drop hiring-process claim, say I helped other reps adopt the approach instead
Co-Authored-By: Claude Sonnet 5 <noreply@anthropic.com>
</commit_message>
<xml_diff>
--- a/assets/Faris_Naber_Resume.docx
+++ b/assets/Faris_Naber_Resume.docx
@@ -53,7 +53,7 @@
         </w:rPr>
         <w:t xml:space="preserve">  ·  </w:t>
       </w:r>
-      <w:hyperlink w:history="1" r:id="rIdtthugsfbo0gtdymvaexpn">
+      <w:hyperlink w:history="1" r:id="rId8zjpghlfkbghrmuyckb36">
         <w:r>
           <w:rPr>
             <w:rFonts w:ascii="Arial" w:cs="Arial" w:eastAsia="Arial" w:hAnsi="Arial"/>
@@ -73,7 +73,7 @@
         </w:rPr>
         <w:t xml:space="preserve">  ·  </w:t>
       </w:r>
-      <w:hyperlink w:history="1" r:id="rIdorxrcswo4ngdanrvikn2e">
+      <w:hyperlink w:history="1" r:id="rIdvl6gk6eq_454yqqqub-xc">
         <w:r>
           <w:rPr>
             <w:rFonts w:ascii="Arial" w:cs="Arial" w:eastAsia="Arial" w:hAnsi="Arial"/>
@@ -93,7 +93,7 @@
         </w:rPr>
         <w:t xml:space="preserve">  ·  </w:t>
       </w:r>
-      <w:hyperlink w:history="1" r:id="rIds8o_mrfcjuzf3zszxx5y0">
+      <w:hyperlink w:history="1" r:id="rIdbp7zpiikxqzjmk8_ghmch">
         <w:r>
           <w:rPr>
             <w:rFonts w:ascii="Arial" w:cs="Arial" w:eastAsia="Arial" w:hAnsi="Arial"/>
@@ -113,7 +113,7 @@
         </w:rPr>
         <w:t xml:space="preserve">  ·  </w:t>
       </w:r>
-      <w:hyperlink w:history="1" r:id="rIdyey1l2lgwwawlzjah0c_0">
+      <w:hyperlink w:history="1" r:id="rIdbitghu5tmfusg4t_qh_1v">
         <w:r>
           <w:rPr>
             <w:rFonts w:ascii="Arial" w:cs="Arial" w:eastAsia="Arial" w:hAnsi="Arial"/>
@@ -520,7 +520,7 @@
           <w:sz w:val="18"/>
           <w:szCs w:val="18"/>
         </w:rPr>
-        <w:t xml:space="preserve">Shaped a repeatable kiosk approach (introduction, hands-on demo, close) and wrote the script, territory plan, objection-handling guide and hiring process for the program.</w:t>
+        <w:t xml:space="preserve">Shaped a repeatable kiosk approach (introduction, hands-on demo, close) and helped other reps on the program adopt it.</w:t>
       </w:r>
     </w:p>
     <w:p>

</xml_diff>

<commit_message>
Title: Founder & CEO -> Founder, Naber Studio (a sales manager may read CEO as unmanageable)
Co-Authored-By: Claude Sonnet 5 <noreply@anthropic.com>
</commit_message>
<xml_diff>
--- a/assets/Faris_Naber_Resume.docx
+++ b/assets/Faris_Naber_Resume.docx
@@ -28,7 +28,7 @@
           <w:sz w:val="21"/>
           <w:szCs w:val="21"/>
         </w:rPr>
-        <w:t xml:space="preserve">Founder &amp; CEO, Naber Studio · Sales Process Design · Field Sales &amp; Market Launch</w:t>
+        <w:t xml:space="preserve">Founder, Naber Studio · Sales Process Design · Field Sales &amp; Market Launch</w:t>
       </w:r>
     </w:p>
     <w:p>
@@ -53,7 +53,7 @@
         </w:rPr>
         <w:t xml:space="preserve">  ·  </w:t>
       </w:r>
-      <w:hyperlink w:history="1" r:id="rId8zjpghlfkbghrmuyckb36">
+      <w:hyperlink w:history="1" r:id="rId1ksil0bxprxffpnqkjfi9">
         <w:r>
           <w:rPr>
             <w:rFonts w:ascii="Arial" w:cs="Arial" w:eastAsia="Arial" w:hAnsi="Arial"/>
@@ -73,7 +73,7 @@
         </w:rPr>
         <w:t xml:space="preserve">  ·  </w:t>
       </w:r>
-      <w:hyperlink w:history="1" r:id="rIdvl6gk6eq_454yqqqub-xc">
+      <w:hyperlink w:history="1" r:id="rIdtbbujm6gp9lrbxvuawkx7">
         <w:r>
           <w:rPr>
             <w:rFonts w:ascii="Arial" w:cs="Arial" w:eastAsia="Arial" w:hAnsi="Arial"/>
@@ -93,7 +93,7 @@
         </w:rPr>
         <w:t xml:space="preserve">  ·  </w:t>
       </w:r>
-      <w:hyperlink w:history="1" r:id="rIdbp7zpiikxqzjmk8_ghmch">
+      <w:hyperlink w:history="1" r:id="rIdfyrybtgnkxentzkq7_of3">
         <w:r>
           <w:rPr>
             <w:rFonts w:ascii="Arial" w:cs="Arial" w:eastAsia="Arial" w:hAnsi="Arial"/>
@@ -113,7 +113,7 @@
         </w:rPr>
         <w:t xml:space="preserve">  ·  </w:t>
       </w:r>
-      <w:hyperlink w:history="1" r:id="rIdbitghu5tmfusg4t_qh_1v">
+      <w:hyperlink w:history="1" r:id="rIdlkznn6ckjwybw3-49fwwd">
         <w:r>
           <w:rPr>
             <w:rFonts w:ascii="Arial" w:cs="Arial" w:eastAsia="Arial" w:hAnsi="Arial"/>
@@ -199,7 +199,7 @@
           <w:sz w:val="18"/>
           <w:szCs w:val="18"/>
         </w:rPr>
-        <w:t xml:space="preserve"> — Founder &amp; CEO</w:t>
+        <w:t xml:space="preserve"> — Founder</w:t>
       </w:r>
       <w:r>
         <w:rPr>

</xml_diff>

<commit_message>
Remove claim of onboarding/leading fireside meetings for new reps - I write the playbook, I don't run onboarding
Co-Authored-By: Claude Sonnet 5 <noreply@anthropic.com>
</commit_message>
<xml_diff>
--- a/assets/Faris_Naber_Resume.docx
+++ b/assets/Faris_Naber_Resume.docx
@@ -53,7 +53,7 @@
         </w:rPr>
         <w:t xml:space="preserve">  ·  </w:t>
       </w:r>
-      <w:hyperlink w:history="1" r:id="rId1ksil0bxprxffpnqkjfi9">
+      <w:hyperlink w:history="1" r:id="rId7ipijnglgysxnrmvqrrr7">
         <w:r>
           <w:rPr>
             <w:rFonts w:ascii="Arial" w:cs="Arial" w:eastAsia="Arial" w:hAnsi="Arial"/>
@@ -73,7 +73,7 @@
         </w:rPr>
         <w:t xml:space="preserve">  ·  </w:t>
       </w:r>
-      <w:hyperlink w:history="1" r:id="rIdtbbujm6gp9lrbxvuawkx7">
+      <w:hyperlink w:history="1" r:id="rIdtxiesi1yocxehnx4pkjwj">
         <w:r>
           <w:rPr>
             <w:rFonts w:ascii="Arial" w:cs="Arial" w:eastAsia="Arial" w:hAnsi="Arial"/>
@@ -93,7 +93,7 @@
         </w:rPr>
         <w:t xml:space="preserve">  ·  </w:t>
       </w:r>
-      <w:hyperlink w:history="1" r:id="rIdfyrybtgnkxentzkq7_of3">
+      <w:hyperlink w:history="1" r:id="rIdmnujngnrwqax4clo62rn8">
         <w:r>
           <w:rPr>
             <w:rFonts w:ascii="Arial" w:cs="Arial" w:eastAsia="Arial" w:hAnsi="Arial"/>
@@ -113,7 +113,7 @@
         </w:rPr>
         <w:t xml:space="preserve">  ·  </w:t>
       </w:r>
-      <w:hyperlink w:history="1" r:id="rIdlkznn6ckjwybw3-49fwwd">
+      <w:hyperlink w:history="1" r:id="rIdotfcpjhi_bywwj9orqeru">
         <w:r>
           <w:rPr>
             <w:rFonts w:ascii="Arial" w:cs="Arial" w:eastAsia="Arial" w:hAnsi="Arial"/>
@@ -410,7 +410,7 @@
           <w:sz w:val="18"/>
           <w:szCs w:val="18"/>
         </w:rPr>
-        <w:t xml:space="preserve">Wrote the territory playbook and lead onboarding sessions that help new reps land their first 10–20 accounts.</w:t>
+        <w:t xml:space="preserve">Wrote the territory playbook that helps new reps land their first 10–20 accounts.</w:t>
       </w:r>
     </w:p>
     <w:p>
@@ -765,7 +765,7 @@
           <w:sz w:val="18"/>
           <w:szCs w:val="18"/>
         </w:rPr>
-        <w:t xml:space="preserve">Sales process design · New business development · Go-to-market strategy · Territory management · Outside and inside sales · Product demonstration · Consultative selling · Lead generation · Training and onboarding</w:t>
+        <w:t xml:space="preserve">Sales process design · New business development · Go-to-market strategy · Territory management · Outside and inside sales · Product demonstration · Consultative selling · Lead generation</w:t>
       </w:r>
     </w:p>
     <w:p>

</xml_diff>